<commit_message>
References as hanging paragraphs, not bullets
The reference list was the last bulleted block in the report, which sat oddly
against prose that carries its enumeration in sentences everywhere else — and
bullets are not how a reference list is set anyway. Now hanging paragraphs.

Also drops the parenthetical on the references heading; the fetch-verification
claim already appears where it belongs, in §6 on calibration, and repeating it
over the bibliography was doing no work.

Rebuild order matters here and is easy to get backwards: gen_web_pages.py
renders from docs/report/artifacts/docspec.json, which build_report_docx.py
emits in its first stage, so the docx build must run first or the web page
regenerates from the previous docspec. test_web_gen::test_web_pages_fresh
catches it.

434 pytest green.

Co-Authored-By: Claude Opus 5 <noreply@anthropic.com>
</commit_message>
<xml_diff>
--- a/docs/report/report.docx
+++ b/docs/report/report.docx
@@ -47073,43 +47073,10 @@
         </w:rPr>
         <w:t xml:space="preserve">Scenario and calibration sources</w:t>
       </w:r>
-      <w:r>
-        <w:rPr>
-          <w:b w:val="false"/>
-          <w:bCs w:val="false"/>
-          <w:i w:val="false"/>
-          <w:iCs w:val="false"/>
-        </w:rPr>
-        <w:t xml:space="preserve"> (each anchor fetch-verified; verbatim quotes and URLs in </w:t>
-      </w:r>
-      <w:r>
-        <w:rPr>
-          <w:rFonts w:ascii="Consolas" w:cs="Consolas" w:eastAsia="Consolas" w:hAnsi="Consolas"/>
-          <w:b w:val="false"/>
-          <w:bCs w:val="false"/>
-          <w:i w:val="false"/>
-          <w:iCs w:val="false"/>
-        </w:rPr>
-        <w:t xml:space="preserve">docs/research/preset-evidence-raw.json</w:t>
-      </w:r>
-      <w:r>
-        <w:rPr>
-          <w:b w:val="false"/>
-          <w:bCs w:val="false"/>
-          <w:i w:val="false"/>
-          <w:iCs w:val="false"/>
-        </w:rPr>
-        <w:t xml:space="preserve">):</w:t>
-      </w:r>
     </w:p>
     <w:p>
       <w:pPr>
-        <w:pStyle w:val="ListParagraph"/>
-        <w:numPr>
-          <w:ilvl w:val="0"/>
-          <w:numId w:val="2"/>
-        </w:numPr>
-        <w:spacing w:after="60"/>
+        <w:spacing w:after="120"/>
       </w:pPr>
       <w:r>
         <w:rPr>
@@ -47123,12 +47090,7 @@
     </w:p>
     <w:p>
       <w:pPr>
-        <w:pStyle w:val="ListParagraph"/>
-        <w:numPr>
-          <w:ilvl w:val="0"/>
-          <w:numId w:val="2"/>
-        </w:numPr>
-        <w:spacing w:after="60"/>
+        <w:spacing w:after="120"/>
       </w:pPr>
       <w:r>
         <w:rPr>
@@ -47137,7 +47099,7 @@
           <w:i w:val="false"/>
           <w:iCs w:val="false"/>
         </w:rPr>
-        <w:t xml:space="preserve">Autor, D., Dorn, D., and Hanson, G. (2016). "The China Shock: Learning from Labor-Market</w:t>
+        <w:t xml:space="preserve">Autor, D., Dorn, D., and Hanson, G. (2016). "The China Shock: Learning from Labor-Market Adjustment to Large Changes in Trade." Annual Review of Economics.</w:t>
       </w:r>
     </w:p>
     <w:p>
@@ -47151,26 +47113,7 @@
           <w:i w:val="false"/>
           <w:iCs w:val="false"/>
         </w:rPr>
-        <w:t xml:space="preserve">Adjustment to Large Changes in Trade." Annual Review of Economics.</w:t>
-      </w:r>
-    </w:p>
-    <w:p>
-      <w:pPr>
-        <w:pStyle w:val="ListParagraph"/>
-        <w:numPr>
-          <w:ilvl w:val="0"/>
-          <w:numId w:val="2"/>
-        </w:numPr>
-        <w:spacing w:after="60"/>
-      </w:pPr>
-      <w:r>
-        <w:rPr>
-          <w:b w:val="false"/>
-          <w:bCs w:val="false"/>
-          <w:i w:val="false"/>
-          <w:iCs w:val="false"/>
-        </w:rPr>
-        <w:t xml:space="preserve">Brynjolfsson, E., Chandar, B., and Chen, R. (2025). "Canaries in the Coal Mine? Six Facts about</w:t>
+        <w:t xml:space="preserve">Brynjolfsson, E., Chandar, B., and Chen, R. (2025). "Canaries in the Coal Mine? Six Facts about the Recent Employment Effects of Artificial Intelligence." Stanford Digital Economy Lab.</w:t>
       </w:r>
     </w:p>
     <w:p>
@@ -47184,26 +47127,7 @@
           <w:i w:val="false"/>
           <w:iCs w:val="false"/>
         </w:rPr>
-        <w:t xml:space="preserve">the Recent Employment Effects of Artificial Intelligence." Stanford Digital Economy Lab.</w:t>
-      </w:r>
-    </w:p>
-    <w:p>
-      <w:pPr>
-        <w:pStyle w:val="ListParagraph"/>
-        <w:numPr>
-          <w:ilvl w:val="0"/>
-          <w:numId w:val="2"/>
-        </w:numPr>
-        <w:spacing w:after="60"/>
-      </w:pPr>
-      <w:r>
-        <w:rPr>
-          <w:b w:val="false"/>
-          <w:bCs w:val="false"/>
-          <w:i w:val="false"/>
-          <w:iCs w:val="false"/>
-        </w:rPr>
-        <w:t xml:space="preserve">Brynjolfsson, E., Li, D., and Raymond, L. (2025). "Generative AI at Work." Quarterly Journal of</w:t>
+        <w:t xml:space="preserve">Brynjolfsson, E., Li, D., and Raymond, L. (2025). "Generative AI at Work." Quarterly Journal of Economics 140(2).</w:t>
       </w:r>
     </w:p>
     <w:p>
@@ -47217,45 +47141,7 @@
           <w:i w:val="false"/>
           <w:iCs w:val="false"/>
         </w:rPr>
-        <w:t xml:space="preserve">Economics 140(2).</w:t>
-      </w:r>
-    </w:p>
-    <w:p>
-      <w:pPr>
-        <w:pStyle w:val="ListParagraph"/>
-        <w:numPr>
-          <w:ilvl w:val="0"/>
-          <w:numId w:val="2"/>
-        </w:numPr>
-        <w:spacing w:after="60"/>
-      </w:pPr>
-      <w:r>
-        <w:rPr>
-          <w:b w:val="false"/>
-          <w:bCs w:val="false"/>
-          <w:i w:val="false"/>
-          <w:iCs w:val="false"/>
-        </w:rPr>
         <w:t xml:space="preserve">Brynjolfsson, E., Rock, D., and Syverson, C. (2021). "The Productivity J-Curve." AEJ: Macro.</w:t>
-      </w:r>
-    </w:p>
-    <w:p>
-      <w:pPr>
-        <w:pStyle w:val="ListParagraph"/>
-        <w:numPr>
-          <w:ilvl w:val="0"/>
-          <w:numId w:val="2"/>
-        </w:numPr>
-        <w:spacing w:after="60"/>
-      </w:pPr>
-      <w:r>
-        <w:rPr>
-          <w:b w:val="false"/>
-          <w:bCs w:val="false"/>
-          <w:i w:val="false"/>
-          <w:iCs w:val="false"/>
-        </w:rPr>
-        <w:t xml:space="preserve">Costinot, A., and Werning, I. (2023). "Robots, Trade, and Luddism: A Sufficient Statistic</w:t>
       </w:r>
     </w:p>
     <w:p>
@@ -47269,26 +47155,7 @@
           <w:i w:val="false"/>
           <w:iCs w:val="false"/>
         </w:rPr>
-        <w:t xml:space="preserve">Approach to Optimal Technology Regulation." Review of Economic Studies.</w:t>
-      </w:r>
-    </w:p>
-    <w:p>
-      <w:pPr>
-        <w:pStyle w:val="ListParagraph"/>
-        <w:numPr>
-          <w:ilvl w:val="0"/>
-          <w:numId w:val="2"/>
-        </w:numPr>
-        <w:spacing w:after="60"/>
-      </w:pPr>
-      <w:r>
-        <w:rPr>
-          <w:b w:val="false"/>
-          <w:bCs w:val="false"/>
-          <w:i w:val="false"/>
-          <w:iCs w:val="false"/>
-        </w:rPr>
-        <w:t xml:space="preserve">Davidson, T. (2023). "What a Compute-Centric Framework Says About Takeoff Speeds." Open</w:t>
+        <w:t xml:space="preserve">Chodorow-Reich, G. (2019). "Geographic Cross-Sectional Fiscal Spending Multipliers: What Have We Learned?" AEJ: Economic Policy.</w:t>
       </w:r>
     </w:p>
     <w:p>
@@ -47302,26 +47169,7 @@
           <w:i w:val="false"/>
           <w:iCs w:val="false"/>
         </w:rPr>
-        <w:t xml:space="preserve">Philanthropy.</w:t>
-      </w:r>
-    </w:p>
-    <w:p>
-      <w:pPr>
-        <w:pStyle w:val="ListParagraph"/>
-        <w:numPr>
-          <w:ilvl w:val="0"/>
-          <w:numId w:val="2"/>
-        </w:numPr>
-        <w:spacing w:after="60"/>
-      </w:pPr>
-      <w:r>
-        <w:rPr>
-          <w:b w:val="false"/>
-          <w:bCs w:val="false"/>
-          <w:i w:val="false"/>
-          <w:iCs w:val="false"/>
-        </w:rPr>
-        <w:t xml:space="preserve">Davis, S., and von Wachter, T. (2011). "Recessions and the Costs of Job Loss." Brookings Papers</w:t>
+        <w:t xml:space="preserve">Costinot, A., and Werning, I. (2023). "Robots, Trade, and Luddism: A Sufficient Statistic Approach to Optimal Technology Regulation." Review of Economic Studies.</w:t>
       </w:r>
     </w:p>
     <w:p>
@@ -47335,26 +47183,7 @@
           <w:i w:val="false"/>
           <w:iCs w:val="false"/>
         </w:rPr>
-        <w:t xml:space="preserve">on Economic Activity.</w:t>
-      </w:r>
-    </w:p>
-    <w:p>
-      <w:pPr>
-        <w:pStyle w:val="ListParagraph"/>
-        <w:numPr>
-          <w:ilvl w:val="0"/>
-          <w:numId w:val="2"/>
-        </w:numPr>
-        <w:spacing w:after="60"/>
-      </w:pPr>
-      <w:r>
-        <w:rPr>
-          <w:b w:val="false"/>
-          <w:bCs w:val="false"/>
-          <w:i w:val="false"/>
-          <w:iCs w:val="false"/>
-        </w:rPr>
-        <w:t xml:space="preserve">Eloundou, T., Manning, S., Mishkin, P., and Rock, D. (2023). "GPTs are GPTs: An Early Look at</w:t>
+        <w:t xml:space="preserve">Davidson, T. (2023). "What a Compute-Centric Framework Says About Takeoff Speeds." Open Philanthropy.</w:t>
       </w:r>
     </w:p>
     <w:p>
@@ -47368,17 +47197,26 @@
           <w:i w:val="false"/>
           <w:iCs w:val="false"/>
         </w:rPr>
-        <w:t xml:space="preserve">the Labor Market Impact Potential of Large Language Models." arXiv:2303.10130.</w:t>
+        <w:t xml:space="preserve">Davis, S., and von Wachter, T. (2011). "Recessions and the Costs of Job Loss." Brookings Papers on Economic Activity.</w:t>
       </w:r>
     </w:p>
     <w:p>
       <w:pPr>
-        <w:pStyle w:val="ListParagraph"/>
-        <w:numPr>
-          <w:ilvl w:val="0"/>
-          <w:numId w:val="2"/>
-        </w:numPr>
-        <w:spacing w:after="60"/>
+        <w:spacing w:after="120"/>
+      </w:pPr>
+      <w:r>
+        <w:rPr>
+          <w:b w:val="false"/>
+          <w:bCs w:val="false"/>
+          <w:i w:val="false"/>
+          <w:iCs w:val="false"/>
+        </w:rPr>
+        <w:t xml:space="preserve">Eloundou, T., Manning, S., Mishkin, P., and Rock, D. (2023). "GPTs are GPTs: An Early Look at the Labor Market Impact Potential of Large Language Models." arXiv:2303.10130.</w:t>
+      </w:r>
+    </w:p>
+    <w:p>
+      <w:pPr>
+        <w:spacing w:after="120"/>
       </w:pPr>
       <w:r>
         <w:rPr>
@@ -47392,12 +47230,7 @@
     </w:p>
     <w:p>
       <w:pPr>
-        <w:pStyle w:val="ListParagraph"/>
-        <w:numPr>
-          <w:ilvl w:val="0"/>
-          <w:numId w:val="2"/>
-        </w:numPr>
-        <w:spacing w:after="60"/>
+        <w:spacing w:after="120"/>
       </w:pPr>
       <w:r>
         <w:rPr>
@@ -47406,7 +47239,7 @@
           <w:i w:val="false"/>
           <w:iCs w:val="false"/>
         </w:rPr>
-        <w:t xml:space="preserve">Farber, H. (2015). "Job Loss in the Great Recession and its Aftermath: U.S. Evidence from the</w:t>
+        <w:t xml:space="preserve">Farber, H. (2015). "Job Loss in the Great Recession and its Aftermath: U.S. Evidence from the Displaced Workers Survey." NBER WP 21216.</w:t>
       </w:r>
     </w:p>
     <w:p>
@@ -47420,26 +47253,7 @@
           <w:i w:val="false"/>
           <w:iCs w:val="false"/>
         </w:rPr>
-        <w:t xml:space="preserve">Displaced Workers Survey." NBER WP 21216.</w:t>
-      </w:r>
-    </w:p>
-    <w:p>
-      <w:pPr>
-        <w:pStyle w:val="ListParagraph"/>
-        <w:numPr>
-          <w:ilvl w:val="0"/>
-          <w:numId w:val="2"/>
-        </w:numPr>
-        <w:spacing w:after="60"/>
-      </w:pPr>
-      <w:r>
-        <w:rPr>
-          <w:b w:val="false"/>
-          <w:bCs w:val="false"/>
-          <w:i w:val="false"/>
-          <w:iCs w:val="false"/>
-        </w:rPr>
-        <w:t xml:space="preserve">Felten, E., Raj, M., and Seamans, R. (2023). "How Will Language Modelers like ChatGPT Affect</w:t>
+        <w:t xml:space="preserve">Felten, E., Raj, M., and Seamans, R. (2023). "How Will Language Modelers like ChatGPT Affect Occupations and Industries?" arXiv:2303.01157.</w:t>
       </w:r>
     </w:p>
     <w:p>
@@ -47453,26 +47267,7 @@
           <w:i w:val="false"/>
           <w:iCs w:val="false"/>
         </w:rPr>
-        <w:t xml:space="preserve">Occupations and Industries?" arXiv:2303.01157.</w:t>
-      </w:r>
-    </w:p>
-    <w:p>
-      <w:pPr>
-        <w:pStyle w:val="ListParagraph"/>
-        <w:numPr>
-          <w:ilvl w:val="0"/>
-          <w:numId w:val="2"/>
-        </w:numPr>
-        <w:spacing w:after="60"/>
-      </w:pPr>
-      <w:r>
-        <w:rPr>
-          <w:b w:val="false"/>
-          <w:bCs w:val="false"/>
-          <w:i w:val="false"/>
-          <w:iCs w:val="false"/>
-        </w:rPr>
-        <w:t xml:space="preserve">Guerreiro, J., Rebelo, S., and Teles, P. (2022). "Should Robots Be Taxed?" Review of Economic</w:t>
+        <w:t xml:space="preserve">Guerreiro, J., Rebelo, S., and Teles, P. (2022). "Should Robots Be Taxed?" Review of Economic Studies 89(1).</w:t>
       </w:r>
     </w:p>
     <w:p>
@@ -47486,26 +47281,7 @@
           <w:i w:val="false"/>
           <w:iCs w:val="false"/>
         </w:rPr>
-        <w:t xml:space="preserve">Studies 89(1).</w:t>
-      </w:r>
-    </w:p>
-    <w:p>
-      <w:pPr>
-        <w:pStyle w:val="ListParagraph"/>
-        <w:numPr>
-          <w:ilvl w:val="0"/>
-          <w:numId w:val="2"/>
-        </w:numPr>
-        <w:spacing w:after="60"/>
-      </w:pPr>
-      <w:r>
-        <w:rPr>
-          <w:b w:val="false"/>
-          <w:bCs w:val="false"/>
-          <w:i w:val="false"/>
-          <w:iCs w:val="false"/>
-        </w:rPr>
-        <w:t xml:space="preserve">Holtmann, S., Braun, A. S., Cho, J., Koch, R., and Langenmayr, D. (2025). "Investment Effects of</w:t>
+        <w:t xml:space="preserve">Holtmann, S., Braun, A. S., Cho, J., Koch, R., and Langenmayr, D. (2025). "Investment Effects of a Quasi-Robot Tax: Evidence from South Korea." arqus Discussion Paper.</w:t>
       </w:r>
     </w:p>
     <w:p>
@@ -47519,26 +47295,7 @@
           <w:i w:val="false"/>
           <w:iCs w:val="false"/>
         </w:rPr>
-        <w:t xml:space="preserve">a Quasi-Robot Tax: Evidence from South Korea." arqus Discussion Paper.</w:t>
-      </w:r>
-    </w:p>
-    <w:p>
-      <w:pPr>
-        <w:pStyle w:val="ListParagraph"/>
-        <w:numPr>
-          <w:ilvl w:val="0"/>
-          <w:numId w:val="2"/>
-        </w:numPr>
-        <w:spacing w:after="60"/>
-      </w:pPr>
-      <w:r>
-        <w:rPr>
-          <w:b w:val="false"/>
-          <w:bCs w:val="false"/>
-          <w:i w:val="false"/>
-          <w:iCs w:val="false"/>
-        </w:rPr>
-        <w:t xml:space="preserve">Ieong, T., Saputra, A., Maniar, A., and Cheng, D. (2026). "Mapping Tax Risks From</w:t>
+        <w:t xml:space="preserve">Ieong, T., Saputra, A., Maniar, A., and Cheng, D. (2026). "Mapping Tax Risks From Labour-Displacing AI." Windfall Trust.</w:t>
       </w:r>
     </w:p>
     <w:p>
@@ -47552,26 +47309,7 @@
           <w:i w:val="false"/>
           <w:iCs w:val="false"/>
         </w:rPr>
-        <w:t xml:space="preserve">Labour-Displacing AI." Windfall Trust.</w:t>
-      </w:r>
-    </w:p>
-    <w:p>
-      <w:pPr>
-        <w:pStyle w:val="ListParagraph"/>
-        <w:numPr>
-          <w:ilvl w:val="0"/>
-          <w:numId w:val="2"/>
-        </w:numPr>
-        <w:spacing w:after="60"/>
-      </w:pPr>
-      <w:r>
-        <w:rPr>
-          <w:b w:val="false"/>
-          <w:bCs w:val="false"/>
-          <w:i w:val="false"/>
-          <w:iCs w:val="false"/>
-        </w:rPr>
-        <w:t xml:space="preserve">Jacobson, L., LaLonde, R., and Sullivan, D. (1993). "Earnings Losses of Displaced Workers."</w:t>
+        <w:t xml:space="preserve">Jacobson, L., LaLonde, R., and Sullivan, D. (1993). "Earnings Losses of Displaced Workers." American Economic Review 83(4).</w:t>
       </w:r>
     </w:p>
     <w:p>
@@ -47585,17 +47323,12 @@
           <w:i w:val="false"/>
           <w:iCs w:val="false"/>
         </w:rPr>
-        <w:t xml:space="preserve">American Economic Review 83(4).</w:t>
+        <w:t xml:space="preserve">Kokotajlo, D., Alexander, S., Larsen, T., Lifland, E., et al. (2025). "AI 2027." AI Futures Project.</w:t>
       </w:r>
     </w:p>
     <w:p>
       <w:pPr>
-        <w:pStyle w:val="ListParagraph"/>
-        <w:numPr>
-          <w:ilvl w:val="0"/>
-          <w:numId w:val="2"/>
-        </w:numPr>
-        <w:spacing w:after="60"/>
+        <w:spacing w:after="120"/>
       </w:pPr>
       <w:r>
         <w:rPr>
@@ -47609,12 +47342,7 @@
     </w:p>
     <w:p>
       <w:pPr>
-        <w:pStyle w:val="ListParagraph"/>
-        <w:numPr>
-          <w:ilvl w:val="0"/>
-          <w:numId w:val="2"/>
-        </w:numPr>
-        <w:spacing w:after="60"/>
+        <w:spacing w:after="120"/>
       </w:pPr>
       <w:r>
         <w:rPr>
@@ -47623,7 +47351,7 @@
           <w:i w:val="false"/>
           <w:iCs w:val="false"/>
         </w:rPr>
-        <w:t xml:space="preserve">Korinek, A., and Stiglitz, J. (2019). "Artificial Intelligence and Its Implications for Income</w:t>
+        <w:t xml:space="preserve">Korinek, A., and Stiglitz, J. (2019). "Artificial Intelligence and Its Implications for Income Distribution and Unemployment." NBER chapter.</w:t>
       </w:r>
     </w:p>
     <w:p>
@@ -47637,45 +47365,7 @@
           <w:i w:val="false"/>
           <w:iCs w:val="false"/>
         </w:rPr>
-        <w:t xml:space="preserve">Distribution and Unemployment." NBER chapter.</w:t>
-      </w:r>
-    </w:p>
-    <w:p>
-      <w:pPr>
-        <w:pStyle w:val="ListParagraph"/>
-        <w:numPr>
-          <w:ilvl w:val="0"/>
-          <w:numId w:val="2"/>
-        </w:numPr>
-        <w:spacing w:after="60"/>
-      </w:pPr>
-      <w:r>
-        <w:rPr>
-          <w:b w:val="false"/>
-          <w:bCs w:val="false"/>
-          <w:i w:val="false"/>
-          <w:iCs w:val="false"/>
-        </w:rPr>
         <w:t xml:space="preserve">Korinek, A., and Suh, D. (2024). "Scenarios for the Transition to AGI." NBER WP 32255.</w:t>
-      </w:r>
-    </w:p>
-    <w:p>
-      <w:pPr>
-        <w:pStyle w:val="ListParagraph"/>
-        <w:numPr>
-          <w:ilvl w:val="0"/>
-          <w:numId w:val="2"/>
-        </w:numPr>
-        <w:spacing w:after="60"/>
-      </w:pPr>
-      <w:r>
-        <w:rPr>
-          <w:b w:val="false"/>
-          <w:bCs w:val="false"/>
-          <w:i w:val="false"/>
-          <w:iCs w:val="false"/>
-        </w:rPr>
-        <w:t xml:space="preserve">Kokotajlo, D., Alexander, S., Larsen, T., Lifland, E., et al. (2025). "AI 2027." AI Futures</w:t>
       </w:r>
     </w:p>
     <w:p>
@@ -47689,36 +47379,12 @@
           <w:i w:val="false"/>
           <w:iCs w:val="false"/>
         </w:rPr>
-        <w:t xml:space="preserve">Project.</w:t>
-      </w:r>
-    </w:p>
-    <w:p>
-      <w:pPr>
-        <w:pStyle w:val="ListParagraph"/>
-        <w:numPr>
-          <w:ilvl w:val="0"/>
-          <w:numId w:val="2"/>
-        </w:numPr>
-        <w:spacing w:after="60"/>
-      </w:pPr>
-      <w:r>
-        <w:rPr>
-          <w:b w:val="false"/>
-          <w:bCs w:val="false"/>
-          <w:i w:val="false"/>
-          <w:iCs w:val="false"/>
-        </w:rPr>
         <w:t xml:space="preserve">MacAskill, W., and Moorhouse, F. (2025). "Preparing for the Intelligence Explosion." Forethought.</w:t>
       </w:r>
     </w:p>
     <w:p>
       <w:pPr>
-        <w:pStyle w:val="ListParagraph"/>
-        <w:numPr>
-          <w:ilvl w:val="0"/>
-          <w:numId w:val="2"/>
-        </w:numPr>
-        <w:spacing w:after="60"/>
+        <w:spacing w:after="120"/>
       </w:pPr>
       <w:r>
         <w:rPr>
@@ -47732,12 +47398,7 @@
     </w:p>
     <w:p>
       <w:pPr>
-        <w:pStyle w:val="ListParagraph"/>
-        <w:numPr>
-          <w:ilvl w:val="0"/>
-          <w:numId w:val="2"/>
-        </w:numPr>
-        <w:spacing w:after="60"/>
+        <w:spacing w:after="120"/>
       </w:pPr>
       <w:r>
         <w:rPr>
@@ -47746,7 +47407,7 @@
           <w:i w:val="false"/>
           <w:iCs w:val="false"/>
         </w:rPr>
-        <w:t xml:space="preserve">Thuemmel, U. (2023). "Optimal Taxation of Robots." Journal of the European Economic Association</w:t>
+        <w:t xml:space="preserve">Thuemmel, U. (2023). "Optimal Taxation of Robots." Journal of the European Economic Association 21(3).</w:t>
       </w:r>
     </w:p>
     <w:p>
@@ -47760,59 +47421,7 @@
           <w:i w:val="false"/>
           <w:iCs w:val="false"/>
         </w:rPr>
-        <w:t xml:space="preserve">21(3).</w:t>
-      </w:r>
-    </w:p>
-    <w:p>
-      <w:pPr>
-        <w:pStyle w:val="ListParagraph"/>
-        <w:numPr>
-          <w:ilvl w:val="0"/>
-          <w:numId w:val="2"/>
-        </w:numPr>
-        <w:spacing w:after="60"/>
-      </w:pPr>
-      <w:r>
-        <w:rPr>
-          <w:b w:val="false"/>
-          <w:bCs w:val="false"/>
-          <w:i w:val="false"/>
-          <w:iCs w:val="false"/>
-        </w:rPr>
         <w:t xml:space="preserve">Webb, M. (2020). "The Impact of Artificial Intelligence on the Labor Market." SSRN 3482150.</w:t>
-      </w:r>
-    </w:p>
-    <w:p>
-      <w:pPr>
-        <w:pStyle w:val="ListParagraph"/>
-        <w:numPr>
-          <w:ilvl w:val="0"/>
-          <w:numId w:val="2"/>
-        </w:numPr>
-        <w:spacing w:after="60"/>
-      </w:pPr>
-      <w:r>
-        <w:rPr>
-          <w:b w:val="false"/>
-          <w:bCs w:val="false"/>
-          <w:i w:val="false"/>
-          <w:iCs w:val="false"/>
-        </w:rPr>
-        <w:t xml:space="preserve">Chodorow-Reich, G. (2019). "Geographic Cross-Sectional Fiscal Spending Multipliers: What Have We</w:t>
-      </w:r>
-    </w:p>
-    <w:p>
-      <w:pPr>
-        <w:spacing w:after="120"/>
-      </w:pPr>
-      <w:r>
-        <w:rPr>
-          <w:b w:val="false"/>
-          <w:bCs w:val="false"/>
-          <w:i w:val="false"/>
-          <w:iCs w:val="false"/>
-        </w:rPr>
-        <w:t xml:space="preserve">Learned?" AEJ: Economic Policy.</w:t>
       </w:r>
     </w:p>
     <w:p>
@@ -48139,12 +47748,6 @@
       <w:startOverride w:val="1"/>
     </w:lvlOverride>
   </w:num>
-  <w:num w:numId="2">
-    <w:abstractNumId w:val="2"/>
-    <w:lvlOverride w:ilvl="0">
-      <w:startOverride w:val="1"/>
-    </w:lvlOverride>
-  </w:num>
 </w:numbering>
 </file>
 

</xml_diff>